<commit_message>
fix: handle modal state and URL synchronization
Improve modal behavior by cleaning up URL search parameters on trigger to prevent infinite re-renders and adding global ESC key listeners for better accessibility across clinical and appointment pages.
</commit_message>
<xml_diff>
--- a/Informe_Tecnico_OrthoSmile_Medic.docx
+++ b/Informe_Tecnico_OrthoSmile_Medic.docx
@@ -88,7 +88,7 @@
           </w:tcPr>
           <w:p>
             <w:r>
-              <w:t xml:space="preserve">OrthoSmile-Medic v1.0</w:t>
+              <w:t xml:space="preserve">OrthoSmile-Medic</w:t>
             </w:r>
           </w:p>
         </w:tc>
@@ -157,7 +157,7 @@
         <w:tc>
           <w:p>
             <w:r>
-              <w:t xml:space="preserve">29 de setiembre de 2026</w:t>
+              <w:t xml:space="preserve">21 de octubre de 2026</w:t>
             </w:r>
           </w:p>
         </w:tc>
@@ -859,6 +859,25 @@
       </w:r>
       <w:r>
         <w:t xml:space="preserve">Eliminación de bibliotecas conflictivas de estilos, consolidando todo el sistema de diseño sobre Tailwind CSS nativo.</w:t>
+      </w:r>
+    </w:p>
+    <w:p>
+      <w:pPr>
+        <w:pStyle w:val="ListParagraph"/>
+        <w:numPr>
+          <w:ilvl w:val="0"/>
+          <w:numId w:val="1"/>
+        </w:numPr>
+      </w:pPr>
+      <w:r>
+        <w:rPr>
+          <w:b/>
+          <w:bCs/>
+        </w:rPr>
+        <w:t xml:space="preserve">Navegación Modal Blindada y Sin Trabas: </w:t>
+      </w:r>
+      <w:r>
+        <w:t xml:space="preserve">Desvinculación síncrona de URLSearchParams, soporte de cierre con tecla Escape, hitboxes táctiles de 44x44px y prevención de congelamientos en toda la suite clínica.</w:t>
       </w:r>
     </w:p>
     <w:p>

</xml_diff>